<commit_message>
feat: Nang cap toan dien tieu de cot tieng Viet va tu dong can rong cot trong cac file mau Excel, CSV, Word
</commit_message>
<xml_diff>
--- a/Du_Lieu_Mau_He_Thong/3_File_Word_DOCX/Bang_bieu_phi_dich_vu_the_va_tai_khoan_2026.docx
+++ b/Du_Lieu_Mau_He_Thong/3_File_Word_DOCX/Bang_bieu_phi_dich_vu_the_va_tai_khoan_2026.docx
@@ -9,13 +9,13 @@
         <w:tblLook w:firstColumn="1" w:firstRow="1" w:lastColumn="0" w:lastRow="0" w:noHBand="0" w:noVBand="1" w:val="04A0"/>
       </w:tblPr>
       <w:tblGrid>
-        <w:gridCol w:w="4608"/>
-        <w:gridCol w:w="5040"/>
+        <w:gridCol w:w="4752"/>
+        <w:gridCol w:w="5184"/>
       </w:tblGrid>
       <w:tr>
         <w:tc>
           <w:tcPr>
-            <w:tcW w:type="dxa" w:w="4824"/>
+            <w:tcW w:type="dxa" w:w="4968"/>
           </w:tcPr>
           <w:p>
             <w:pPr>
@@ -25,7 +25,7 @@
               <w:rPr>
                 <w:b/>
                 <w:color w:val="00843D"/>
-                <w:sz w:val="20"/>
+                <w:sz w:val="21"/>
               </w:rPr>
               <w:t>NGÂN HÀNG TMCP NGOẠI THƯƠNG VIỆT NAM</w:t>
               <w:br/>
@@ -35,7 +35,7 @@
         </w:tc>
         <w:tc>
           <w:tcPr>
-            <w:tcW w:type="dxa" w:w="4824"/>
+            <w:tcW w:type="dxa" w:w="4968"/>
           </w:tcPr>
           <w:p>
             <w:pPr>
@@ -58,7 +58,7 @@
     </w:tbl>
     <w:p>
       <w:pPr>
-        <w:spacing w:after="80"/>
+        <w:spacing w:after="120"/>
       </w:pPr>
     </w:p>
     <w:p>
@@ -217,11 +217,12 @@
     </w:p>
     <w:p>
       <w:pPr>
-        <w:spacing w:before="160"/>
+        <w:spacing w:before="200" w:after="80"/>
       </w:pPr>
       <w:r>
         <w:rPr>
           <w:b/>
+          <w:color w:val="006E32"/>
           <w:sz w:val="21"/>
         </w:rPr>
         <w:t>BẢNG KÊ QUY ĐỊNH CHI TIẾT:</w:t>
@@ -235,83 +236,87 @@
         <w:tblLook w:firstColumn="1" w:firstRow="1" w:lastColumn="0" w:lastRow="0" w:noHBand="0" w:noVBand="1" w:val="04A0"/>
       </w:tblPr>
       <w:tblGrid>
-        <w:gridCol w:w="1930"/>
-        <w:gridCol w:w="1930"/>
-        <w:gridCol w:w="1930"/>
-        <w:gridCol w:w="1930"/>
-        <w:gridCol w:w="1930"/>
+        <w:gridCol w:w="1987"/>
+        <w:gridCol w:w="1987"/>
+        <w:gridCol w:w="1987"/>
+        <w:gridCol w:w="1987"/>
+        <w:gridCol w:w="1987"/>
       </w:tblGrid>
       <w:tr>
         <w:tc>
           <w:tcPr>
-            <w:tcW w:type="dxa" w:w="1930"/>
-            <w:shd w:fill="E8F5E9"/>
+            <w:tcW w:type="dxa" w:w="1987"/>
+            <w:shd w:fill="00843D"/>
           </w:tcPr>
           <w:p>
             <w:pPr>
-              <w:spacing w:before="40" w:after="40"/>
+              <w:spacing w:before="60" w:after="60"/>
               <w:jc w:val="center"/>
             </w:pPr>
             <w:r>
               <w:rPr>
                 <w:b/>
+                <w:color w:val="FFFFFF"/>
                 <w:sz w:val="19"/>
               </w:rPr>
-              <w:t>Dịch vụ tài khoản &amp; thẻ</w:t>
+              <w:t>Dịch vụ tài khoản &amp; thẻ thanh toán</w:t>
             </w:r>
           </w:p>
         </w:tc>
         <w:tc>
           <w:tcPr>
-            <w:tcW w:type="dxa" w:w="1930"/>
-            <w:shd w:fill="E8F5E9"/>
+            <w:tcW w:type="dxa" w:w="1987"/>
+            <w:shd w:fill="00843D"/>
           </w:tcPr>
           <w:p>
             <w:pPr>
-              <w:spacing w:before="40" w:after="40"/>
+              <w:spacing w:before="60" w:after="60"/>
               <w:jc w:val="center"/>
             </w:pPr>
             <w:r>
               <w:rPr>
                 <w:b/>
+                <w:color w:val="FFFFFF"/>
                 <w:sz w:val="19"/>
               </w:rPr>
-              <w:t>Mức phí chuẩn (VND)</w:t>
+              <w:t>Mức phí tiêu chuẩn (VND)</w:t>
             </w:r>
           </w:p>
         </w:tc>
         <w:tc>
           <w:tcPr>
-            <w:tcW w:type="dxa" w:w="1930"/>
-            <w:shd w:fill="E8F5E9"/>
+            <w:tcW w:type="dxa" w:w="1987"/>
+            <w:shd w:fill="00843D"/>
           </w:tcPr>
           <w:p>
             <w:pPr>
-              <w:spacing w:before="40" w:after="40"/>
+              <w:spacing w:before="60" w:after="60"/>
               <w:jc w:val="center"/>
             </w:pPr>
             <w:r>
               <w:rPr>
                 <w:b/>
+                <w:color w:val="FFFFFF"/>
                 <w:sz w:val="19"/>
               </w:rPr>
-              <w:t>Ưu đãi khách hàng Digibank</w:t>
+              <w:t>Ưu đãi trên VCB Digibank</w:t>
             </w:r>
           </w:p>
         </w:tc>
         <w:tc>
           <w:tcPr>
-            <w:tcW w:type="dxa" w:w="1930"/>
-            <w:shd w:fill="E8F5E9"/>
+            <w:tcW w:type="dxa" w:w="1987"/>
+            <w:shd w:fill="00843D"/>
           </w:tcPr>
           <w:p>
             <w:pPr>
-              <w:spacing w:before="40" w:after="40"/>
+              <w:spacing w:before="60" w:after="60"/>
               <w:jc w:val="center"/>
             </w:pPr>
             <w:r>
               <w:rPr>
                 <w:b/>
+                <w:color w:val="FFFFFF"/>
                 <w:sz w:val="19"/>
               </w:rPr>
               <w:t>Khách hàng Priority VIP</w:t>
@@ -320,20 +325,21 @@
         </w:tc>
         <w:tc>
           <w:tcPr>
-            <w:tcW w:type="dxa" w:w="1930"/>
-            <w:shd w:fill="E8F5E9"/>
+            <w:tcW w:type="dxa" w:w="1987"/>
+            <w:shd w:fill="00843D"/>
           </w:tcPr>
           <w:p>
             <w:pPr>
-              <w:spacing w:before="40" w:after="40"/>
+              <w:spacing w:before="60" w:after="60"/>
               <w:jc w:val="center"/>
             </w:pPr>
             <w:r>
               <w:rPr>
                 <w:b/>
+                <w:color w:val="FFFFFF"/>
                 <w:sz w:val="19"/>
               </w:rPr>
-              <w:t>Ghi chú</w:t>
+              <w:t>Ghi chú quy định</w:t>
             </w:r>
           </w:p>
         </w:tc>
@@ -341,11 +347,12 @@
       <w:tr>
         <w:tc>
           <w:tcPr>
-            <w:tcW w:type="dxa" w:w="1930"/>
+            <w:tcW w:type="dxa" w:w="1987"/>
+            <w:shd w:fill="F4F9F5"/>
           </w:tcPr>
           <w:p>
             <w:pPr>
-              <w:spacing w:before="40" w:after="40"/>
+              <w:spacing w:before="60" w:after="60"/>
               <w:jc w:val="center"/>
             </w:pPr>
             <w:r>
@@ -358,11 +365,30 @@
         </w:tc>
         <w:tc>
           <w:tcPr>
-            <w:tcW w:type="dxa" w:w="1930"/>
+            <w:tcW w:type="dxa" w:w="1987"/>
+            <w:shd w:fill="F4F9F5"/>
           </w:tcPr>
           <w:p>
             <w:pPr>
-              <w:spacing w:before="40" w:after="40"/>
+              <w:spacing w:before="60" w:after="60"/>
+              <w:jc w:val="left"/>
+            </w:pPr>
+            <w:r>
+              <w:rPr>
+                <w:sz w:val="19"/>
+              </w:rPr>
+              <w:t>0</w:t>
+            </w:r>
+          </w:p>
+        </w:tc>
+        <w:tc>
+          <w:tcPr>
+            <w:tcW w:type="dxa" w:w="1987"/>
+            <w:shd w:fill="F4F9F5"/>
+          </w:tcPr>
+          <w:p>
+            <w:pPr>
+              <w:spacing w:before="60" w:after="60"/>
               <w:jc w:val="left"/>
             </w:pPr>
             <w:r>
@@ -375,11 +401,12 @@
         </w:tc>
         <w:tc>
           <w:tcPr>
-            <w:tcW w:type="dxa" w:w="1930"/>
+            <w:tcW w:type="dxa" w:w="1987"/>
+            <w:shd w:fill="F4F9F5"/>
           </w:tcPr>
           <w:p>
             <w:pPr>
-              <w:spacing w:before="40" w:after="40"/>
+              <w:spacing w:before="60" w:after="60"/>
               <w:jc w:val="left"/>
             </w:pPr>
             <w:r>
@@ -392,11 +419,173 @@
         </w:tc>
         <w:tc>
           <w:tcPr>
-            <w:tcW w:type="dxa" w:w="1930"/>
+            <w:tcW w:type="dxa" w:w="1987"/>
+            <w:shd w:fill="F4F9F5"/>
           </w:tcPr>
           <w:p>
             <w:pPr>
-              <w:spacing w:before="40" w:after="40"/>
+              <w:spacing w:before="60" w:after="60"/>
+              <w:jc w:val="left"/>
+            </w:pPr>
+            <w:r>
+              <w:rPr>
+                <w:sz w:val="19"/>
+              </w:rPr>
+              <w:t>Mở tại quầy giao dịch hoặc eKYC trực tuyến</w:t>
+            </w:r>
+          </w:p>
+        </w:tc>
+      </w:tr>
+      <w:tr>
+        <w:tc>
+          <w:tcPr>
+            <w:tcW w:type="dxa" w:w="1987"/>
+          </w:tcPr>
+          <w:p>
+            <w:pPr>
+              <w:spacing w:before="60" w:after="60"/>
+              <w:jc w:val="center"/>
+            </w:pPr>
+            <w:r>
+              <w:rPr>
+                <w:sz w:val="19"/>
+              </w:rPr>
+              <w:t>Duy trì số dư tài khoản tối thiểu</w:t>
+            </w:r>
+          </w:p>
+        </w:tc>
+        <w:tc>
+          <w:tcPr>
+            <w:tcW w:type="dxa" w:w="1987"/>
+          </w:tcPr>
+          <w:p>
+            <w:pPr>
+              <w:spacing w:before="60" w:after="60"/>
+              <w:jc w:val="left"/>
+            </w:pPr>
+            <w:r>
+              <w:rPr>
+                <w:sz w:val="19"/>
+              </w:rPr>
+              <w:t>0</w:t>
+            </w:r>
+          </w:p>
+        </w:tc>
+        <w:tc>
+          <w:tcPr>
+            <w:tcW w:type="dxa" w:w="1987"/>
+          </w:tcPr>
+          <w:p>
+            <w:pPr>
+              <w:spacing w:before="60" w:after="60"/>
+              <w:jc w:val="left"/>
+            </w:pPr>
+            <w:r>
+              <w:rPr>
+                <w:sz w:val="19"/>
+              </w:rPr>
+              <w:t>0 VND</w:t>
+            </w:r>
+          </w:p>
+        </w:tc>
+        <w:tc>
+          <w:tcPr>
+            <w:tcW w:type="dxa" w:w="1987"/>
+          </w:tcPr>
+          <w:p>
+            <w:pPr>
+              <w:spacing w:before="60" w:after="60"/>
+              <w:jc w:val="left"/>
+            </w:pPr>
+            <w:r>
+              <w:rPr>
+                <w:sz w:val="19"/>
+              </w:rPr>
+              <w:t>0 VND</w:t>
+            </w:r>
+          </w:p>
+        </w:tc>
+        <w:tc>
+          <w:tcPr>
+            <w:tcW w:type="dxa" w:w="1987"/>
+          </w:tcPr>
+          <w:p>
+            <w:pPr>
+              <w:spacing w:before="60" w:after="60"/>
+              <w:jc w:val="left"/>
+            </w:pPr>
+            <w:r>
+              <w:rPr>
+                <w:sz w:val="19"/>
+              </w:rPr>
+              <w:t>Không yêu cầu duy trì số dư</w:t>
+            </w:r>
+          </w:p>
+        </w:tc>
+      </w:tr>
+      <w:tr>
+        <w:tc>
+          <w:tcPr>
+            <w:tcW w:type="dxa" w:w="1987"/>
+            <w:shd w:fill="F4F9F5"/>
+          </w:tcPr>
+          <w:p>
+            <w:pPr>
+              <w:spacing w:before="60" w:after="60"/>
+              <w:jc w:val="center"/>
+            </w:pPr>
+            <w:r>
+              <w:rPr>
+                <w:sz w:val="19"/>
+              </w:rPr>
+              <w:t>Phát hành thẻ ghi nợ Vietcombank Connect24</w:t>
+            </w:r>
+          </w:p>
+        </w:tc>
+        <w:tc>
+          <w:tcPr>
+            <w:tcW w:type="dxa" w:w="1987"/>
+            <w:shd w:fill="F4F9F5"/>
+          </w:tcPr>
+          <w:p>
+            <w:pPr>
+              <w:spacing w:before="60" w:after="60"/>
+              <w:jc w:val="left"/>
+            </w:pPr>
+            <w:r>
+              <w:rPr>
+                <w:sz w:val="19"/>
+              </w:rPr>
+              <w:t>50000</w:t>
+            </w:r>
+          </w:p>
+        </w:tc>
+        <w:tc>
+          <w:tcPr>
+            <w:tcW w:type="dxa" w:w="1987"/>
+            <w:shd w:fill="F4F9F5"/>
+          </w:tcPr>
+          <w:p>
+            <w:pPr>
+              <w:spacing w:before="60" w:after="60"/>
+              <w:jc w:val="left"/>
+            </w:pPr>
+            <w:r>
+              <w:rPr>
+                <w:sz w:val="19"/>
+              </w:rPr>
+              <w:t>Miễn phí khi mở online</w:t>
+            </w:r>
+          </w:p>
+        </w:tc>
+        <w:tc>
+          <w:tcPr>
+            <w:tcW w:type="dxa" w:w="1987"/>
+            <w:shd w:fill="F4F9F5"/>
+          </w:tcPr>
+          <w:p>
+            <w:pPr>
+              <w:spacing w:before="60" w:after="60"/>
               <w:jc w:val="left"/>
             </w:pPr>
             <w:r>
@@ -409,18 +598,19 @@
         </w:tc>
         <w:tc>
           <w:tcPr>
-            <w:tcW w:type="dxa" w:w="1930"/>
+            <w:tcW w:type="dxa" w:w="1987"/>
+            <w:shd w:fill="F4F9F5"/>
           </w:tcPr>
           <w:p>
             <w:pPr>
-              <w:spacing w:before="40" w:after="40"/>
+              <w:spacing w:before="60" w:after="60"/>
               <w:jc w:val="left"/>
             </w:pPr>
             <w:r>
               <w:rPr>
                 <w:sz w:val="19"/>
               </w:rPr>
-              <w:t>Mở tại quầy hoặc eKYC</w:t>
+              <w:t>Thẻ chip không tiếp xúc Contactless</w:t>
             </w:r>
           </w:p>
         </w:tc>
@@ -428,149 +618,62 @@
       <w:tr>
         <w:tc>
           <w:tcPr>
-            <w:tcW w:type="dxa" w:w="1930"/>
+            <w:tcW w:type="dxa" w:w="1987"/>
           </w:tcPr>
           <w:p>
             <w:pPr>
-              <w:spacing w:before="40" w:after="40"/>
+              <w:spacing w:before="60" w:after="60"/>
               <w:jc w:val="center"/>
             </w:pPr>
             <w:r>
               <w:rPr>
                 <w:sz w:val="19"/>
               </w:rPr>
-              <w:t>Duy trì số dư tài khoản tối thiểu</w:t>
+              <w:t>Rút tiền tại cây ATM cùng hệ thống VCB</w:t>
             </w:r>
           </w:p>
         </w:tc>
         <w:tc>
           <w:tcPr>
-            <w:tcW w:type="dxa" w:w="1930"/>
+            <w:tcW w:type="dxa" w:w="1987"/>
           </w:tcPr>
           <w:p>
             <w:pPr>
-              <w:spacing w:before="40" w:after="40"/>
+              <w:spacing w:before="60" w:after="60"/>
               <w:jc w:val="left"/>
             </w:pPr>
             <w:r>
               <w:rPr>
                 <w:sz w:val="19"/>
               </w:rPr>
-              <w:t>0 VND</w:t>
+              <w:t>1100</w:t>
             </w:r>
           </w:p>
         </w:tc>
         <w:tc>
           <w:tcPr>
-            <w:tcW w:type="dxa" w:w="1930"/>
+            <w:tcW w:type="dxa" w:w="1987"/>
           </w:tcPr>
           <w:p>
             <w:pPr>
-              <w:spacing w:before="40" w:after="40"/>
+              <w:spacing w:before="60" w:after="60"/>
               <w:jc w:val="left"/>
             </w:pPr>
             <w:r>
               <w:rPr>
                 <w:sz w:val="19"/>
               </w:rPr>
-              <w:t>0 VND</w:t>
+              <w:t>1,100 VND / GD</w:t>
             </w:r>
           </w:p>
         </w:tc>
         <w:tc>
           <w:tcPr>
-            <w:tcW w:type="dxa" w:w="1930"/>
+            <w:tcW w:type="dxa" w:w="1987"/>
           </w:tcPr>
           <w:p>
             <w:pPr>
-              <w:spacing w:before="40" w:after="40"/>
-              <w:jc w:val="left"/>
-            </w:pPr>
-            <w:r>
-              <w:rPr>
-                <w:sz w:val="19"/>
-              </w:rPr>
-              <w:t>0 VND</w:t>
-            </w:r>
-          </w:p>
-        </w:tc>
-        <w:tc>
-          <w:tcPr>
-            <w:tcW w:type="dxa" w:w="1930"/>
-          </w:tcPr>
-          <w:p>
-            <w:pPr>
-              <w:spacing w:before="40" w:after="40"/>
-              <w:jc w:val="left"/>
-            </w:pPr>
-            <w:r>
-              <w:rPr>
-                <w:sz w:val="19"/>
-              </w:rPr>
-              <w:t>Không yêu cầu số dư</w:t>
-            </w:r>
-          </w:p>
-        </w:tc>
-      </w:tr>
-      <w:tr>
-        <w:tc>
-          <w:tcPr>
-            <w:tcW w:type="dxa" w:w="1930"/>
-          </w:tcPr>
-          <w:p>
-            <w:pPr>
-              <w:spacing w:before="40" w:after="40"/>
-              <w:jc w:val="center"/>
-            </w:pPr>
-            <w:r>
-              <w:rPr>
-                <w:sz w:val="19"/>
-              </w:rPr>
-              <w:t>Phát hành thẻ ghi nợ Vietcombank Connect24</w:t>
-            </w:r>
-          </w:p>
-        </w:tc>
-        <w:tc>
-          <w:tcPr>
-            <w:tcW w:type="dxa" w:w="1930"/>
-          </w:tcPr>
-          <w:p>
-            <w:pPr>
-              <w:spacing w:before="40" w:after="40"/>
-              <w:jc w:val="left"/>
-            </w:pPr>
-            <w:r>
-              <w:rPr>
-                <w:sz w:val="19"/>
-              </w:rPr>
-              <w:t>50,000 VND</w:t>
-            </w:r>
-          </w:p>
-        </w:tc>
-        <w:tc>
-          <w:tcPr>
-            <w:tcW w:type="dxa" w:w="1930"/>
-          </w:tcPr>
-          <w:p>
-            <w:pPr>
-              <w:spacing w:before="40" w:after="40"/>
-              <w:jc w:val="left"/>
-            </w:pPr>
-            <w:r>
-              <w:rPr>
-                <w:sz w:val="19"/>
-              </w:rPr>
-              <w:t>Miễn phí khi mở online</w:t>
-            </w:r>
-          </w:p>
-        </w:tc>
-        <w:tc>
-          <w:tcPr>
-            <w:tcW w:type="dxa" w:w="1930"/>
-          </w:tcPr>
-          <w:p>
-            <w:pPr>
-              <w:spacing w:before="40" w:after="40"/>
+              <w:spacing w:before="60" w:after="60"/>
               <w:jc w:val="left"/>
             </w:pPr>
             <w:r>
@@ -583,18 +686,18 @@
         </w:tc>
         <w:tc>
           <w:tcPr>
-            <w:tcW w:type="dxa" w:w="1930"/>
+            <w:tcW w:type="dxa" w:w="1987"/>
           </w:tcPr>
           <w:p>
             <w:pPr>
-              <w:spacing w:before="40" w:after="40"/>
+              <w:spacing w:before="60" w:after="60"/>
               <w:jc w:val="left"/>
             </w:pPr>
             <w:r>
               <w:rPr>
                 <w:sz w:val="19"/>
               </w:rPr>
-              <w:t>Thẻ chip Contactless</w:t>
+              <w:t>Đã bao gồm thuế GTGT (VAT)</w:t>
             </w:r>
           </w:p>
         </w:tc>
@@ -602,62 +705,66 @@
       <w:tr>
         <w:tc>
           <w:tcPr>
-            <w:tcW w:type="dxa" w:w="1930"/>
+            <w:tcW w:type="dxa" w:w="1987"/>
+            <w:shd w:fill="F4F9F5"/>
           </w:tcPr>
           <w:p>
             <w:pPr>
-              <w:spacing w:before="40" w:after="40"/>
+              <w:spacing w:before="60" w:after="60"/>
               <w:jc w:val="center"/>
             </w:pPr>
             <w:r>
               <w:rPr>
                 <w:sz w:val="19"/>
               </w:rPr>
-              <w:t>Rút tiền tại ATM cùng hệ thống Vietcombank</w:t>
+              <w:t>Rút tiền tại cây ATM ngoài hệ thống (Napas)</w:t>
             </w:r>
           </w:p>
         </w:tc>
         <w:tc>
           <w:tcPr>
-            <w:tcW w:type="dxa" w:w="1930"/>
+            <w:tcW w:type="dxa" w:w="1987"/>
+            <w:shd w:fill="F4F9F5"/>
           </w:tcPr>
           <w:p>
             <w:pPr>
-              <w:spacing w:before="40" w:after="40"/>
+              <w:spacing w:before="60" w:after="60"/>
               <w:jc w:val="left"/>
             </w:pPr>
             <w:r>
               <w:rPr>
                 <w:sz w:val="19"/>
               </w:rPr>
-              <w:t>1,100 VND / GD</w:t>
+              <w:t>3300</w:t>
             </w:r>
           </w:p>
         </w:tc>
         <w:tc>
           <w:tcPr>
-            <w:tcW w:type="dxa" w:w="1930"/>
+            <w:tcW w:type="dxa" w:w="1987"/>
+            <w:shd w:fill="F4F9F5"/>
           </w:tcPr>
           <w:p>
             <w:pPr>
-              <w:spacing w:before="40" w:after="40"/>
+              <w:spacing w:before="60" w:after="60"/>
               <w:jc w:val="left"/>
             </w:pPr>
             <w:r>
               <w:rPr>
                 <w:sz w:val="19"/>
               </w:rPr>
-              <w:t>1,100 VND / GD</w:t>
+              <w:t>3,300 VND / GD</w:t>
             </w:r>
           </w:p>
         </w:tc>
         <w:tc>
           <w:tcPr>
-            <w:tcW w:type="dxa" w:w="1930"/>
+            <w:tcW w:type="dxa" w:w="1987"/>
+            <w:shd w:fill="F4F9F5"/>
           </w:tcPr>
           <w:p>
             <w:pPr>
-              <w:spacing w:before="40" w:after="40"/>
+              <w:spacing w:before="60" w:after="60"/>
               <w:jc w:val="left"/>
             </w:pPr>
             <w:r>
@@ -670,18 +777,19 @@
         </w:tc>
         <w:tc>
           <w:tcPr>
-            <w:tcW w:type="dxa" w:w="1930"/>
+            <w:tcW w:type="dxa" w:w="1987"/>
+            <w:shd w:fill="F4F9F5"/>
           </w:tcPr>
           <w:p>
             <w:pPr>
-              <w:spacing w:before="40" w:after="40"/>
+              <w:spacing w:before="60" w:after="60"/>
               <w:jc w:val="left"/>
             </w:pPr>
             <w:r>
               <w:rPr>
                 <w:sz w:val="19"/>
               </w:rPr>
-              <w:t>Đã bao gồm VAT</w:t>
+              <w:t>Đã bao gồm thuế GTGT (VAT)</w:t>
             </w:r>
           </w:p>
         </w:tc>
@@ -689,62 +797,62 @@
       <w:tr>
         <w:tc>
           <w:tcPr>
-            <w:tcW w:type="dxa" w:w="1930"/>
+            <w:tcW w:type="dxa" w:w="1987"/>
           </w:tcPr>
           <w:p>
             <w:pPr>
-              <w:spacing w:before="40" w:after="40"/>
+              <w:spacing w:before="60" w:after="60"/>
               <w:jc w:val="center"/>
             </w:pPr>
             <w:r>
               <w:rPr>
                 <w:sz w:val="19"/>
               </w:rPr>
-              <w:t>Rút tiền tại ATM ngân hàng khác (Napas)</w:t>
+              <w:t>Chuyển tiền trong và ngoài hệ thống VCB</w:t>
             </w:r>
           </w:p>
         </w:tc>
         <w:tc>
           <w:tcPr>
-            <w:tcW w:type="dxa" w:w="1930"/>
+            <w:tcW w:type="dxa" w:w="1987"/>
           </w:tcPr>
           <w:p>
             <w:pPr>
-              <w:spacing w:before="40" w:after="40"/>
+              <w:spacing w:before="60" w:after="60"/>
               <w:jc w:val="left"/>
             </w:pPr>
             <w:r>
               <w:rPr>
                 <w:sz w:val="19"/>
               </w:rPr>
-              <w:t>3,300 VND / GD</w:t>
+              <w:t>0</w:t>
             </w:r>
           </w:p>
         </w:tc>
         <w:tc>
           <w:tcPr>
-            <w:tcW w:type="dxa" w:w="1930"/>
+            <w:tcW w:type="dxa" w:w="1987"/>
           </w:tcPr>
           <w:p>
             <w:pPr>
-              <w:spacing w:before="40" w:after="40"/>
+              <w:spacing w:before="60" w:after="60"/>
               <w:jc w:val="left"/>
             </w:pPr>
             <w:r>
               <w:rPr>
                 <w:sz w:val="19"/>
               </w:rPr>
-              <w:t>3,300 VND / GD</w:t>
+              <w:t>Miễn phí trọn đời</w:t>
             </w:r>
           </w:p>
         </w:tc>
         <w:tc>
           <w:tcPr>
-            <w:tcW w:type="dxa" w:w="1930"/>
+            <w:tcW w:type="dxa" w:w="1987"/>
           </w:tcPr>
           <w:p>
             <w:pPr>
-              <w:spacing w:before="40" w:after="40"/>
+              <w:spacing w:before="60" w:after="60"/>
               <w:jc w:val="left"/>
             </w:pPr>
             <w:r>
@@ -757,18 +865,18 @@
         </w:tc>
         <w:tc>
           <w:tcPr>
-            <w:tcW w:type="dxa" w:w="1930"/>
+            <w:tcW w:type="dxa" w:w="1987"/>
           </w:tcPr>
           <w:p>
             <w:pPr>
-              <w:spacing w:before="40" w:after="40"/>
+              <w:spacing w:before="60" w:after="60"/>
               <w:jc w:val="left"/>
             </w:pPr>
             <w:r>
               <w:rPr>
                 <w:sz w:val="19"/>
               </w:rPr>
-              <w:t>Đã bao gồm VAT</w:t>
+              <w:t>Áp dụng cho mọi giao dịch trên Digibank</w:t>
             </w:r>
           </w:p>
         </w:tc>
@@ -776,98 +884,12 @@
       <w:tr>
         <w:tc>
           <w:tcPr>
-            <w:tcW w:type="dxa" w:w="1930"/>
+            <w:tcW w:type="dxa" w:w="1987"/>
+            <w:shd w:fill="F4F9F5"/>
           </w:tcPr>
           <w:p>
             <w:pPr>
-              <w:spacing w:before="40" w:after="40"/>
-              <w:jc w:val="center"/>
-            </w:pPr>
-            <w:r>
-              <w:rPr>
-                <w:sz w:val="19"/>
-              </w:rPr>
-              <w:t>Chuyển tiền trong &amp; ngoài hệ thống VCB</w:t>
-            </w:r>
-          </w:p>
-        </w:tc>
-        <w:tc>
-          <w:tcPr>
-            <w:tcW w:type="dxa" w:w="1930"/>
-          </w:tcPr>
-          <w:p>
-            <w:pPr>
-              <w:spacing w:before="40" w:after="40"/>
-              <w:jc w:val="left"/>
-            </w:pPr>
-            <w:r>
-              <w:rPr>
-                <w:sz w:val="19"/>
-              </w:rPr>
-              <w:t>0 VND</w:t>
-            </w:r>
-          </w:p>
-        </w:tc>
-        <w:tc>
-          <w:tcPr>
-            <w:tcW w:type="dxa" w:w="1930"/>
-          </w:tcPr>
-          <w:p>
-            <w:pPr>
-              <w:spacing w:before="40" w:after="40"/>
-              <w:jc w:val="left"/>
-            </w:pPr>
-            <w:r>
-              <w:rPr>
-                <w:sz w:val="19"/>
-              </w:rPr>
-              <w:t>0 VND</w:t>
-            </w:r>
-          </w:p>
-        </w:tc>
-        <w:tc>
-          <w:tcPr>
-            <w:tcW w:type="dxa" w:w="1930"/>
-          </w:tcPr>
-          <w:p>
-            <w:pPr>
-              <w:spacing w:before="40" w:after="40"/>
-              <w:jc w:val="left"/>
-            </w:pPr>
-            <w:r>
-              <w:rPr>
-                <w:sz w:val="19"/>
-              </w:rPr>
-              <w:t>0 VND</w:t>
-            </w:r>
-          </w:p>
-        </w:tc>
-        <w:tc>
-          <w:tcPr>
-            <w:tcW w:type="dxa" w:w="1930"/>
-          </w:tcPr>
-          <w:p>
-            <w:pPr>
-              <w:spacing w:before="40" w:after="40"/>
-              <w:jc w:val="left"/>
-            </w:pPr>
-            <w:r>
-              <w:rPr>
-                <w:sz w:val="19"/>
-              </w:rPr>
-              <w:t>Miễn phí trọn đời trên Digibank</w:t>
-            </w:r>
-          </w:p>
-        </w:tc>
-      </w:tr>
-      <w:tr>
-        <w:tc>
-          <w:tcPr>
-            <w:tcW w:type="dxa" w:w="1930"/>
-          </w:tcPr>
-          <w:p>
-            <w:pPr>
-              <w:spacing w:before="40" w:after="40"/>
+              <w:spacing w:before="60" w:after="60"/>
               <w:jc w:val="center"/>
             </w:pPr>
             <w:r>
@@ -880,11 +902,30 @@
         </w:tc>
         <w:tc>
           <w:tcPr>
-            <w:tcW w:type="dxa" w:w="1930"/>
+            <w:tcW w:type="dxa" w:w="1987"/>
+            <w:shd w:fill="F4F9F5"/>
           </w:tcPr>
           <w:p>
             <w:pPr>
-              <w:spacing w:before="40" w:after="40"/>
+              <w:spacing w:before="60" w:after="60"/>
+              <w:jc w:val="left"/>
+            </w:pPr>
+            <w:r>
+              <w:rPr>
+                <w:sz w:val="19"/>
+              </w:rPr>
+              <w:t>30000</w:t>
+            </w:r>
+          </w:p>
+        </w:tc>
+        <w:tc>
+          <w:tcPr>
+            <w:tcW w:type="dxa" w:w="1987"/>
+            <w:shd w:fill="F4F9F5"/>
+          </w:tcPr>
+          <w:p>
+            <w:pPr>
+              <w:spacing w:before="60" w:after="60"/>
               <w:jc w:val="left"/>
             </w:pPr>
             <w:r>
@@ -897,28 +938,12 @@
         </w:tc>
         <w:tc>
           <w:tcPr>
-            <w:tcW w:type="dxa" w:w="1930"/>
+            <w:tcW w:type="dxa" w:w="1987"/>
+            <w:shd w:fill="F4F9F5"/>
           </w:tcPr>
           <w:p>
             <w:pPr>
-              <w:spacing w:before="40" w:after="40"/>
-              <w:jc w:val="left"/>
-            </w:pPr>
-            <w:r>
-              <w:rPr>
-                <w:sz w:val="19"/>
-              </w:rPr>
-              <w:t>30,000 VND / tháng</w:t>
-            </w:r>
-          </w:p>
-        </w:tc>
-        <w:tc>
-          <w:tcPr>
-            <w:tcW w:type="dxa" w:w="1930"/>
-          </w:tcPr>
-          <w:p>
-            <w:pPr>
-              <w:spacing w:before="40" w:after="40"/>
+              <w:spacing w:before="60" w:after="60"/>
               <w:jc w:val="left"/>
             </w:pPr>
             <w:r>
@@ -931,18 +956,19 @@
         </w:tc>
         <w:tc>
           <w:tcPr>
-            <w:tcW w:type="dxa" w:w="1930"/>
+            <w:tcW w:type="dxa" w:w="1987"/>
+            <w:shd w:fill="F4F9F5"/>
           </w:tcPr>
           <w:p>
             <w:pPr>
-              <w:spacing w:before="40" w:after="40"/>
+              <w:spacing w:before="60" w:after="60"/>
               <w:jc w:val="left"/>
             </w:pPr>
             <w:r>
               <w:rPr>
                 <w:sz w:val="19"/>
               </w:rPr>
-              <w:t>Chỉ thu khi tài khoản còn số dư</w:t>
+              <w:t>Chỉ thu khi tài khoản còn số dư dương</w:t>
             </w:r>
           </w:p>
         </w:tc>
@@ -950,7 +976,7 @@
     </w:tbl>
     <w:p>
       <w:pPr>
-        <w:spacing w:before="280"/>
+        <w:spacing w:before="320"/>
       </w:pPr>
     </w:p>
     <w:tbl>
@@ -960,13 +986,13 @@
         <w:tblLook w:firstColumn="1" w:firstRow="1" w:lastColumn="0" w:lastRow="0" w:noHBand="0" w:noVBand="1" w:val="04A0"/>
       </w:tblPr>
       <w:tblGrid>
-        <w:gridCol w:w="4752"/>
         <w:gridCol w:w="4896"/>
+        <w:gridCol w:w="5040"/>
       </w:tblGrid>
       <w:tr>
         <w:tc>
           <w:tcPr>
-            <w:tcW w:type="dxa" w:w="4824"/>
+            <w:tcW w:type="dxa" w:w="4968"/>
           </w:tcPr>
           <w:p>
             <w:pPr>
@@ -990,7 +1016,7 @@
         </w:tc>
         <w:tc>
           <w:tcPr>
-            <w:tcW w:type="dxa" w:w="4824"/>
+            <w:tcW w:type="dxa" w:w="4968"/>
           </w:tcPr>
           <w:p>
             <w:pPr>
@@ -1016,7 +1042,7 @@
     </w:tbl>
     <w:sectPr>
       <w:pgSz w:w="12240" w:h="15840"/>
-      <w:pgMar w:top="1152" w:right="1296" w:bottom="1152" w:left="1296" w:header="720" w:footer="720" w:gutter="0"/>
+      <w:pgMar w:top="1152" w:right="1152" w:bottom="1152" w:left="1152" w:header="720" w:footer="720" w:gutter="0"/>
       <w:cols w:space="720"/>
       <w:docGrid w:linePitch="360"/>
     </w:sectPr>

</xml_diff>